<commit_message>
Update volume288 author biography exactly as supplied; retain 383 pages, all chapters and original publication date; no reindex
</commit_message>
<xml_diff>
--- a/public/books/m/288/downloads/chen-feng-beauvoir-v1.0.docx
+++ b/public/books/m/288/downloads/chen-feng-beauvoir-v1.0.docx
@@ -328,17 +328,22 @@
     </w:p>
     <w:p>
       <w:r>
-        <w:t>陈凤，SDE发生学的长期学习者与写作者。本书是她在“讲大师”学员卷中的一部。她关注的不是替思想家做几条结论摘要，而是一个判断怎样从具体处境中形成，怎样遇见反例，又怎样重新接受检验。</w:t>
-      </w:r>
-    </w:p>
-    <w:p>
-      <w:r>
-        <w:t>她希望把这些问题带回普通人的日常：为什么孩子会被一个标签困住，为什么亲密关系里容易把爱变成替别人决定，为什么一个人在需要帮助时仍然应该作为主体被看见。理论只有重新进入具体生活，才不只是记住几个名字。</w:t>
-      </w:r>
-    </w:p>
-    <w:p>
-      <w:r>
-        <w:t>本书所用的SDE读法——显露、差异序列与特征纠缠——归属王德生博士；对波伏娃的具体取舍、解释与错误，仍由作者承担。</w:t>
+        <w:t>陈凤，长期关注教育、女性成长、婚姻家庭、亲子关系，以及人工智能时代人的成长与教育。自2022年8月起跟随王德生博士持续学习，亲历其思想从“三视角”、321智慧，到SIO、SDE发生学不断生成与完善的过程。</w:t>
+      </w:r>
+    </w:p>
+    <w:p>
+      <w:r>
+        <w:t>几年的学习，也逐渐改变了我理解世界的方式：比起急着判断一个人、一件事“是什么”，我更愿意追问——它为什么会变成今天这样，又是怎样一步一步发生的？</w:t>
+      </w:r>
+    </w:p>
+    <w:p>
+      <w:r>
+        <w:t>我尝试把发生学带回真实生活，在孩子的成长、夫妻关系、女性处境、教育实践与自己的生命经验中不断观察、验证和修正理解。对我而言，发生学不是一套远离生活的理论，而是一种重新看见生活的方法：在学习中体验发生，在发生中理解自己、他人与世界。</w:t>
+      </w:r>
+    </w:p>
+    <w:p>
+      <w:r>
+        <w:t>现持续进行SDE发生学本体论下的阅读、研究。</w:t>
       </w:r>
     </w:p>
     <w:p>

</xml_diff>